<commit_message>
Science - 10/2/2026 part 1
</commit_message>
<xml_diff>
--- a/1-Formal sciences/1-Mathematics/3-Pure Mathematics/3-Space/2-Euclidean Geometry/5-My Source/1-Plane Geometry/20-Types of Geometric Construction/11-Constructing Triangle.docx
+++ b/1-Formal sciences/1-Mathematics/3-Pure Mathematics/3-Space/2-Euclidean Geometry/5-My Source/1-Plane Geometry/20-Types of Geometric Construction/11-Constructing Triangle.docx
@@ -236,7 +236,7 @@
     <w:p>
       <w:pPr>
         <w:rPr>
-          <w:rFonts w:ascii="Roboto Mono" w:hAnsi="Roboto Mono" w:hint="cs"/>
+          <w:rFonts w:ascii="Roboto Mono" w:hAnsi="Roboto Mono"/>
           <w:rtl/>
           <w:lang w:bidi="ar-EG"/>
         </w:rPr>
@@ -754,7 +754,7 @@
           <w:rFonts w:ascii="Roboto Mono" w:hAnsi="Roboto Mono"/>
         </w:rPr>
         <w:pict w14:anchorId="008CFA39">
-          <v:rect id="_x0000_i1085" style="width:0;height:1.5pt" o:hralign="center" o:hrstd="t" o:hr="t" fillcolor="#a0a0a0" stroked="f"/>
+          <v:rect id="_x0000_i1025" style="width:0;height:1.5pt" o:hralign="center" o:hrstd="t" o:hr="t" fillcolor="#a0a0a0" stroked="f"/>
         </w:pict>
       </w:r>
     </w:p>
@@ -1399,6 +1399,9 @@
             </m:e>
           </m:borderBox>
           <m:r>
+            <m:rPr>
+              <m:sty m:val="p"/>
+            </m:rPr>
             <w:rPr>
               <w:rFonts w:ascii="Roboto Mono" w:hAnsi="Roboto Mono"/>
             </w:rPr>
@@ -1424,6 +1427,9 @@
             </m:e>
           </m:borderBox>
           <m:r>
+            <m:rPr>
+              <m:sty m:val="p"/>
+            </m:rPr>
             <w:rPr>
               <w:rFonts w:ascii="Roboto Mono" w:hAnsi="Roboto Mono"/>
             </w:rPr>
@@ -1475,7 +1481,7 @@
           <w:rFonts w:ascii="Roboto Mono" w:hAnsi="Roboto Mono"/>
         </w:rPr>
         <w:pict w14:anchorId="3B681FC5">
-          <v:rect id="_x0000_i1086" style="width:0;height:1.5pt" o:hralign="center" o:hrstd="t" o:hr="t" fillcolor="#a0a0a0" stroked="f"/>
+          <v:rect id="_x0000_i1026" style="width:0;height:1.5pt" o:hralign="center" o:hrstd="t" o:hr="t" fillcolor="#a0a0a0" stroked="f"/>
         </w:pict>
       </w:r>
     </w:p>
@@ -1891,7 +1897,7 @@
           <w:rFonts w:ascii="Roboto Mono" w:hAnsi="Roboto Mono"/>
         </w:rPr>
         <w:pict w14:anchorId="249791D9">
-          <v:rect id="_x0000_i1087" style="width:0;height:1.5pt" o:hralign="center" o:hrstd="t" o:hr="t" fillcolor="#a0a0a0" stroked="f"/>
+          <v:rect id="_x0000_i1027" style="width:0;height:1.5pt" o:hralign="center" o:hrstd="t" o:hr="t" fillcolor="#a0a0a0" stroked="f"/>
         </w:pict>
       </w:r>
     </w:p>
@@ -2364,7 +2370,7 @@
           <w:rFonts w:ascii="Roboto Mono" w:hAnsi="Roboto Mono"/>
         </w:rPr>
         <w:pict w14:anchorId="65C3097F">
-          <v:rect id="_x0000_i1088" style="width:0;height:1.5pt" o:hralign="center" o:hrstd="t" o:hr="t" fillcolor="#a0a0a0" stroked="f"/>
+          <v:rect id="_x0000_i1028" style="width:0;height:1.5pt" o:hralign="center" o:hrstd="t" o:hr="t" fillcolor="#a0a0a0" stroked="f"/>
         </w:pict>
       </w:r>
     </w:p>
@@ -2978,7 +2984,7 @@
           <w:rFonts w:ascii="Roboto Mono" w:hAnsi="Roboto Mono"/>
         </w:rPr>
         <w:pict w14:anchorId="06503AE9">
-          <v:rect id="_x0000_i1089" style="width:0;height:1.5pt" o:hralign="center" o:hrstd="t" o:hr="t" fillcolor="#a0a0a0" stroked="f"/>
+          <v:rect id="_x0000_i1029" style="width:0;height:1.5pt" o:hralign="center" o:hrstd="t" o:hr="t" fillcolor="#a0a0a0" stroked="f"/>
         </w:pict>
       </w:r>
     </w:p>
@@ -3384,6 +3390,1066 @@
     </w:p>
     <w:p>
       <w:pPr>
+        <w:pStyle w:val="Heading3"/>
+      </w:pPr>
+      <w:r>
+        <w:t xml:space="preserve">6. </w:t>
+      </w:r>
+      <w:r>
+        <w:t>Incenter Construction</w:t>
+      </w:r>
+    </w:p>
+    <w:p>
+      <w:pPr>
+        <w:rPr>
+          <w:rFonts w:ascii="Arial" w:eastAsia="Arial" w:hAnsi="Arial" w:cs="Arial"/>
+          <w:color w:val="000000"/>
+          <w:sz w:val="18"/>
+        </w:rPr>
+      </w:pPr>
+      <w:r>
+        <w:rPr>
+          <w:rFonts w:ascii="Arial" w:eastAsia="Arial" w:hAnsi="Arial" w:cs="Arial"/>
+          <w:b/>
+          <w:color w:val="000000"/>
+          <w:sz w:val="18"/>
+          <w:highlight w:val="lightGray"/>
+        </w:rPr>
+        <w:t># Source: AI Source: Provided by: [Data Path</w:t>
+      </w:r>
+      <w:r>
+        <w:rPr>
+          <w:rFonts w:ascii="Arial" w:eastAsia="Arial" w:hAnsi="Arial" w:cs="Arial"/>
+          <w:color w:val="000000"/>
+          <w:sz w:val="18"/>
+          <w:highlight w:val="lightGray"/>
+        </w:rPr>
+        <w:t xml:space="preserve">: Persons Table -&gt; ID Column: 1, Name_En Column: Motasem Essam] -&gt; </w:t>
+      </w:r>
+      <w:r>
+        <w:rPr>
+          <w:rFonts w:ascii="Arial" w:eastAsia="Arial" w:hAnsi="Arial" w:cs="Arial"/>
+          <w:b/>
+          <w:color w:val="000000"/>
+          <w:sz w:val="18"/>
+          <w:highlight w:val="lightGray"/>
+        </w:rPr>
+        <w:t>From:</w:t>
+      </w:r>
+      <w:r>
+        <w:rPr>
+          <w:rFonts w:ascii="Arial" w:eastAsia="Arial" w:hAnsi="Arial" w:cs="Arial"/>
+          <w:color w:val="000000"/>
+          <w:sz w:val="18"/>
+          <w:highlight w:val="lightGray"/>
+        </w:rPr>
+        <w:t xml:space="preserve"> [ChatGPT] </w:t>
+      </w:r>
+      <w:r>
+        <w:rPr>
+          <w:rFonts w:ascii="Arial" w:eastAsia="Arial" w:hAnsi="Arial" w:cs="Arial"/>
+          <w:b/>
+          <w:color w:val="000000"/>
+          <w:sz w:val="18"/>
+          <w:highlight w:val="lightGray"/>
+        </w:rPr>
+        <w:t>on</w:t>
+      </w:r>
+      <w:r>
+        <w:rPr>
+          <w:rFonts w:ascii="Arial" w:eastAsia="Arial" w:hAnsi="Arial" w:cs="Arial"/>
+          <w:color w:val="000000"/>
+          <w:sz w:val="18"/>
+          <w:highlight w:val="lightGray"/>
+        </w:rPr>
+        <w:t xml:space="preserve"> [7/25/2026]</w:t>
+      </w:r>
+    </w:p>
+    <w:p>
+      <w:pPr>
+        <w:rPr>
+          <w:rFonts w:ascii="Roboto Mono" w:hAnsi="Roboto Mono"/>
+          <w:b/>
+          <w:bCs/>
+        </w:rPr>
+      </w:pPr>
+      <w:r>
+        <w:rPr>
+          <w:rFonts w:ascii="Roboto Mono" w:hAnsi="Roboto Mono"/>
+          <w:b/>
+          <w:bCs/>
+        </w:rPr>
+        <w:t>Definition</w:t>
+      </w:r>
+    </w:p>
+    <w:p>
+      <w:pPr>
+        <w:rPr>
+          <w:rFonts w:ascii="Roboto Mono" w:hAnsi="Roboto Mono"/>
+        </w:rPr>
+      </w:pPr>
+      <w:r>
+        <w:rPr>
+          <w:rFonts w:ascii="Roboto Mono" w:hAnsi="Roboto Mono"/>
+          <w:b/>
+          <w:bCs/>
+        </w:rPr>
+        <w:t>Incenter Construction</w:t>
+      </w:r>
+      <w:r>
+        <w:rPr>
+          <w:rFonts w:ascii="Roboto Mono" w:hAnsi="Roboto Mono"/>
+        </w:rPr>
+        <w:t xml:space="preserve"> is the construction of the </w:t>
+      </w:r>
+      <w:r>
+        <w:rPr>
+          <w:rFonts w:ascii="Roboto Mono" w:hAnsi="Roboto Mono"/>
+          <w:b/>
+          <w:bCs/>
+        </w:rPr>
+        <w:t>incenter</w:t>
+      </w:r>
+      <w:r>
+        <w:rPr>
+          <w:rFonts w:ascii="Roboto Mono" w:hAnsi="Roboto Mono"/>
+        </w:rPr>
+        <w:t xml:space="preserve"> of a triangle by constructing its three angle bisectors.</w:t>
+      </w:r>
+    </w:p>
+    <w:p>
+      <w:pPr>
+        <w:rPr>
+          <w:rFonts w:ascii="Roboto Mono" w:hAnsi="Roboto Mono"/>
+        </w:rPr>
+      </w:pPr>
+      <w:r>
+        <w:rPr>
+          <w:rFonts w:ascii="Roboto Mono" w:hAnsi="Roboto Mono"/>
+        </w:rPr>
+        <w:t xml:space="preserve">The three internal angle bisectors of a triangle intersect at one common point called the </w:t>
+      </w:r>
+      <w:r>
+        <w:rPr>
+          <w:rFonts w:ascii="Roboto Mono" w:hAnsi="Roboto Mono"/>
+          <w:b/>
+          <w:bCs/>
+        </w:rPr>
+        <w:t>incenter</w:t>
+      </w:r>
+      <w:r>
+        <w:rPr>
+          <w:rFonts w:ascii="Roboto Mono" w:hAnsi="Roboto Mono"/>
+        </w:rPr>
+        <w:t xml:space="preserve">, usually denoted by </w:t>
+      </w:r>
+      <m:oMath>
+        <m:r>
+          <w:rPr>
+            <w:rFonts w:ascii="Cambria Math" w:hAnsi="Cambria Math"/>
+          </w:rPr>
+          <m:t>I</m:t>
+        </m:r>
+      </m:oMath>
+      <w:r>
+        <w:rPr>
+          <w:rFonts w:ascii="Roboto Mono" w:hAnsi="Roboto Mono"/>
+        </w:rPr>
+        <w:t>.</w:t>
+      </w:r>
+    </w:p>
+    <w:p>
+      <w:pPr>
+        <w:rPr>
+          <w:rFonts w:ascii="Roboto Mono" w:hAnsi="Roboto Mono"/>
+        </w:rPr>
+      </w:pPr>
+      <w:r>
+        <w:rPr>
+          <w:rFonts w:ascii="Roboto Mono" w:hAnsi="Roboto Mono"/>
+        </w:rPr>
+        <w:lastRenderedPageBreak/>
+        <w:t>Because each constructed line is an angle bisector, the construction establishes equal angle relationships such as:</w:t>
+      </w:r>
+    </w:p>
+    <w:p>
+      <w:pPr>
+        <w:rPr>
+          <w:rFonts w:ascii="Roboto Mono" w:hAnsi="Roboto Mono"/>
+        </w:rPr>
+      </w:pPr>
+      <m:oMathPara>
+        <m:oMath>
+          <m:borderBox>
+            <m:borderBoxPr>
+              <m:ctrlPr>
+                <w:rPr>
+                  <w:rFonts w:ascii="Cambria Math" w:hAnsi="Cambria Math"/>
+                </w:rPr>
+              </m:ctrlPr>
+            </m:borderBoxPr>
+            <m:e>
+              <m:r>
+                <w:rPr>
+                  <w:rFonts w:ascii="Cambria Math" w:hAnsi="Cambria Math"/>
+                </w:rPr>
+                <m:t>m∠BAI=m∠IAC</m:t>
+              </m:r>
+            </m:e>
+          </m:borderBox>
+          <m:r>
+            <w:rPr>
+              <w:rFonts w:ascii="Roboto Mono" w:hAnsi="Roboto Mono"/>
+            </w:rPr>
+            <w:br/>
+          </m:r>
+        </m:oMath>
+        <m:oMath>
+          <m:borderBox>
+            <m:borderBoxPr>
+              <m:ctrlPr>
+                <w:rPr>
+                  <w:rFonts w:ascii="Cambria Math" w:hAnsi="Cambria Math"/>
+                </w:rPr>
+              </m:ctrlPr>
+            </m:borderBoxPr>
+            <m:e>
+              <m:r>
+                <w:rPr>
+                  <w:rFonts w:ascii="Cambria Math" w:hAnsi="Cambria Math"/>
+                </w:rPr>
+                <m:t>m∠ABI=m∠IBC</m:t>
+              </m:r>
+            </m:e>
+          </m:borderBox>
+          <m:r>
+            <w:rPr>
+              <w:rFonts w:ascii="Roboto Mono" w:hAnsi="Roboto Mono"/>
+            </w:rPr>
+            <w:br/>
+          </m:r>
+        </m:oMath>
+        <m:oMath>
+          <m:borderBox>
+            <m:borderBoxPr>
+              <m:ctrlPr>
+                <w:rPr>
+                  <w:rFonts w:ascii="Cambria Math" w:hAnsi="Cambria Math"/>
+                </w:rPr>
+              </m:ctrlPr>
+            </m:borderBoxPr>
+            <m:e>
+              <m:r>
+                <w:rPr>
+                  <w:rFonts w:ascii="Cambria Math" w:hAnsi="Cambria Math"/>
+                </w:rPr>
+                <m:t>m∠ACI=m∠ICB</m:t>
+              </m:r>
+            </m:e>
+          </m:borderBox>
+          <m:r>
+            <w:rPr>
+              <w:rFonts w:ascii="Roboto Mono" w:hAnsi="Roboto Mono"/>
+            </w:rPr>
+            <w:br/>
+          </m:r>
+        </m:oMath>
+      </m:oMathPara>
+    </w:p>
+    <w:p>
+      <w:pPr>
+        <w:rPr>
+          <w:rFonts w:ascii="Roboto Mono" w:hAnsi="Roboto Mono"/>
+        </w:rPr>
+      </w:pPr>
+      <w:r>
+        <w:rPr>
+          <w:rFonts w:ascii="Roboto Mono" w:hAnsi="Roboto Mono"/>
+        </w:rPr>
+        <w:t>The incenter also has equal perpendicular distances from the three sides:</w:t>
+      </w:r>
+    </w:p>
+    <w:p>
+      <w:pPr>
+        <w:rPr>
+          <w:rFonts w:ascii="Roboto Mono" w:hAnsi="Roboto Mono"/>
+        </w:rPr>
+      </w:pPr>
+      <m:oMathPara>
+        <m:oMath>
+          <m:borderBox>
+            <m:borderBoxPr>
+              <m:ctrlPr>
+                <w:rPr>
+                  <w:rFonts w:ascii="Cambria Math" w:hAnsi="Cambria Math"/>
+                </w:rPr>
+              </m:ctrlPr>
+            </m:borderBoxPr>
+            <m:e>
+              <m:r>
+                <w:rPr>
+                  <w:rFonts w:ascii="Cambria Math" w:hAnsi="Cambria Math"/>
+                </w:rPr>
+                <m:t>d</m:t>
+              </m:r>
+              <m:d>
+                <m:dPr>
+                  <m:sepChr m:val=","/>
+                  <m:ctrlPr>
+                    <w:rPr>
+                      <w:rFonts w:ascii="Cambria Math" w:hAnsi="Cambria Math"/>
+                    </w:rPr>
+                  </m:ctrlPr>
+                </m:dPr>
+                <m:e>
+                  <m:r>
+                    <w:rPr>
+                      <w:rFonts w:ascii="Cambria Math" w:hAnsi="Cambria Math"/>
+                    </w:rPr>
+                    <m:t>I</m:t>
+                  </m:r>
+                </m:e>
+                <m:e>
+                  <m:r>
+                    <w:rPr>
+                      <w:rFonts w:ascii="Cambria Math" w:hAnsi="Cambria Math"/>
+                    </w:rPr>
+                    <m:t>AB</m:t>
+                  </m:r>
+                </m:e>
+              </m:d>
+              <m:r>
+                <w:rPr>
+                  <w:rFonts w:ascii="Cambria Math" w:hAnsi="Cambria Math"/>
+                </w:rPr>
+                <m:t>=d</m:t>
+              </m:r>
+              <m:d>
+                <m:dPr>
+                  <m:sepChr m:val=","/>
+                  <m:ctrlPr>
+                    <w:rPr>
+                      <w:rFonts w:ascii="Cambria Math" w:hAnsi="Cambria Math"/>
+                    </w:rPr>
+                  </m:ctrlPr>
+                </m:dPr>
+                <m:e>
+                  <m:r>
+                    <w:rPr>
+                      <w:rFonts w:ascii="Cambria Math" w:hAnsi="Cambria Math"/>
+                    </w:rPr>
+                    <m:t>I</m:t>
+                  </m:r>
+                </m:e>
+                <m:e>
+                  <m:r>
+                    <w:rPr>
+                      <w:rFonts w:ascii="Cambria Math" w:hAnsi="Cambria Math"/>
+                    </w:rPr>
+                    <m:t>BC</m:t>
+                  </m:r>
+                </m:e>
+              </m:d>
+              <m:r>
+                <w:rPr>
+                  <w:rFonts w:ascii="Cambria Math" w:hAnsi="Cambria Math"/>
+                </w:rPr>
+                <m:t>=d</m:t>
+              </m:r>
+              <m:d>
+                <m:dPr>
+                  <m:sepChr m:val=","/>
+                  <m:ctrlPr>
+                    <w:rPr>
+                      <w:rFonts w:ascii="Cambria Math" w:hAnsi="Cambria Math"/>
+                    </w:rPr>
+                  </m:ctrlPr>
+                </m:dPr>
+                <m:e>
+                  <m:r>
+                    <w:rPr>
+                      <w:rFonts w:ascii="Cambria Math" w:hAnsi="Cambria Math"/>
+                    </w:rPr>
+                    <m:t>I</m:t>
+                  </m:r>
+                </m:e>
+                <m:e>
+                  <m:r>
+                    <w:rPr>
+                      <w:rFonts w:ascii="Cambria Math" w:hAnsi="Cambria Math"/>
+                    </w:rPr>
+                    <m:t>CA</m:t>
+                  </m:r>
+                </m:e>
+              </m:d>
+            </m:e>
+          </m:borderBox>
+          <m:r>
+            <w:rPr>
+              <w:rFonts w:ascii="Roboto Mono" w:hAnsi="Roboto Mono"/>
+            </w:rPr>
+            <w:br/>
+          </m:r>
+        </m:oMath>
+      </m:oMathPara>
+    </w:p>
+    <w:p>
+      <w:pPr>
+        <w:rPr>
+          <w:rFonts w:ascii="Roboto Mono" w:hAnsi="Roboto Mono"/>
+        </w:rPr>
+      </w:pPr>
+      <w:r>
+        <w:rPr>
+          <w:rFonts w:ascii="Roboto Mono" w:hAnsi="Roboto Mono"/>
+        </w:rPr>
+        <w:t>The angle equalities come directly from the angle-bisector constructions; the equal distances follow from the relevant geometric theorem.</w:t>
+      </w:r>
+    </w:p>
+    <w:p>
+      <w:pPr>
+        <w:rPr>
+          <w:rFonts w:ascii="Roboto Mono" w:hAnsi="Roboto Mono"/>
+          <w:b/>
+          <w:bCs/>
+        </w:rPr>
+      </w:pPr>
+      <w:r>
+        <w:rPr>
+          <w:rFonts w:ascii="Roboto Mono" w:hAnsi="Roboto Mono"/>
+          <w:b/>
+          <w:bCs/>
+        </w:rPr>
+        <w:t>Construction</w:t>
+      </w:r>
+    </w:p>
+    <w:p>
+      <w:pPr>
+        <w:rPr>
+          <w:rFonts w:ascii="Roboto Mono" w:hAnsi="Roboto Mono"/>
+        </w:rPr>
+      </w:pPr>
+      <w:r>
+        <w:rPr>
+          <w:rFonts w:ascii="Roboto Mono" w:hAnsi="Roboto Mono"/>
+        </w:rPr>
+        <w:t>Given:</w:t>
+      </w:r>
+    </w:p>
+    <w:p>
+      <w:pPr>
+        <w:rPr>
+          <w:rFonts w:ascii="Roboto Mono" w:hAnsi="Roboto Mono"/>
+        </w:rPr>
+      </w:pPr>
+      <m:oMathPara>
+        <m:oMath>
+          <m:r>
+            <w:rPr>
+              <w:rFonts w:ascii="Cambria Math" w:hAnsi="Cambria Math"/>
+            </w:rPr>
+            <m:t>△ABC</m:t>
+          </m:r>
+          <m:r>
+            <w:rPr>
+              <w:rFonts w:ascii="Roboto Mono" w:hAnsi="Roboto Mono"/>
+              <w:i/>
+            </w:rPr>
+            <w:br/>
+          </m:r>
+        </m:oMath>
+      </m:oMathPara>
+    </w:p>
+    <w:p>
+      <w:pPr>
+        <w:numPr>
+          <w:ilvl w:val="0"/>
+          <w:numId w:val="24"/>
+        </w:numPr>
+        <w:rPr>
+          <w:rFonts w:ascii="Roboto Mono" w:hAnsi="Roboto Mono"/>
+        </w:rPr>
+      </w:pPr>
+      <w:r>
+        <w:rPr>
+          <w:rFonts w:ascii="Roboto Mono" w:hAnsi="Roboto Mono"/>
+        </w:rPr>
+        <w:t xml:space="preserve">Construct the angle bisector of </w:t>
+      </w:r>
+      <m:oMath>
+        <m:r>
+          <w:rPr>
+            <w:rFonts w:ascii="Cambria Math" w:hAnsi="Cambria Math"/>
+          </w:rPr>
+          <m:t>∠A</m:t>
+        </m:r>
+      </m:oMath>
+      <w:r>
+        <w:rPr>
+          <w:rFonts w:ascii="Roboto Mono" w:hAnsi="Roboto Mono"/>
+        </w:rPr>
+        <w:t xml:space="preserve">. </w:t>
+      </w:r>
+    </w:p>
+    <w:p>
+      <w:pPr>
+        <w:numPr>
+          <w:ilvl w:val="0"/>
+          <w:numId w:val="24"/>
+        </w:numPr>
+        <w:rPr>
+          <w:rFonts w:ascii="Roboto Mono" w:hAnsi="Roboto Mono"/>
+        </w:rPr>
+      </w:pPr>
+      <w:r>
+        <w:rPr>
+          <w:rFonts w:ascii="Roboto Mono" w:hAnsi="Roboto Mono"/>
+        </w:rPr>
+        <w:t xml:space="preserve">Construct the angle bisector of </w:t>
+      </w:r>
+      <m:oMath>
+        <m:r>
+          <w:rPr>
+            <w:rFonts w:ascii="Cambria Math" w:hAnsi="Cambria Math"/>
+          </w:rPr>
+          <m:t>∠B</m:t>
+        </m:r>
+      </m:oMath>
+      <w:r>
+        <w:rPr>
+          <w:rFonts w:ascii="Roboto Mono" w:hAnsi="Roboto Mono"/>
+        </w:rPr>
+        <w:t xml:space="preserve">. </w:t>
+      </w:r>
+    </w:p>
+    <w:p>
+      <w:pPr>
+        <w:numPr>
+          <w:ilvl w:val="0"/>
+          <w:numId w:val="24"/>
+        </w:numPr>
+        <w:rPr>
+          <w:rFonts w:ascii="Roboto Mono" w:hAnsi="Roboto Mono"/>
+        </w:rPr>
+      </w:pPr>
+      <w:r>
+        <w:rPr>
+          <w:rFonts w:ascii="Roboto Mono" w:hAnsi="Roboto Mono"/>
+        </w:rPr>
+        <w:t xml:space="preserve">Let the two angle bisectors intersect at </w:t>
+      </w:r>
+      <m:oMath>
+        <m:r>
+          <w:rPr>
+            <w:rFonts w:ascii="Cambria Math" w:hAnsi="Cambria Math"/>
+          </w:rPr>
+          <m:t>I</m:t>
+        </m:r>
+      </m:oMath>
+      <w:r>
+        <w:rPr>
+          <w:rFonts w:ascii="Roboto Mono" w:hAnsi="Roboto Mono"/>
+        </w:rPr>
+        <w:t xml:space="preserve">. </w:t>
+      </w:r>
+    </w:p>
+    <w:p>
+      <w:pPr>
+        <w:numPr>
+          <w:ilvl w:val="0"/>
+          <w:numId w:val="24"/>
+        </w:numPr>
+        <w:rPr>
+          <w:rFonts w:ascii="Roboto Mono" w:hAnsi="Roboto Mono"/>
+        </w:rPr>
+      </w:pPr>
+      <m:oMath>
+        <m:r>
+          <w:rPr>
+            <w:rFonts w:ascii="Cambria Math" w:hAnsi="Cambria Math"/>
+          </w:rPr>
+          <m:t>I</m:t>
+        </m:r>
+      </m:oMath>
+      <w:r>
+        <w:rPr>
+          <w:rFonts w:ascii="Roboto Mono" w:hAnsi="Roboto Mono"/>
+        </w:rPr>
+        <w:t xml:space="preserve">is the incenter. </w:t>
+      </w:r>
+    </w:p>
+    <w:p>
+      <w:pPr>
+        <w:numPr>
+          <w:ilvl w:val="0"/>
+          <w:numId w:val="24"/>
+        </w:numPr>
+        <w:rPr>
+          <w:rFonts w:ascii="Roboto Mono" w:hAnsi="Roboto Mono"/>
+        </w:rPr>
+      </w:pPr>
+      <w:r>
+        <w:rPr>
+          <w:rFonts w:ascii="Roboto Mono" w:hAnsi="Roboto Mono"/>
+        </w:rPr>
+        <w:t xml:space="preserve">The angle bisector of </w:t>
+      </w:r>
+      <m:oMath>
+        <m:r>
+          <w:rPr>
+            <w:rFonts w:ascii="Cambria Math" w:hAnsi="Cambria Math"/>
+          </w:rPr>
+          <m:t>∠C</m:t>
+        </m:r>
+      </m:oMath>
+      <w:r>
+        <w:rPr>
+          <w:rFonts w:ascii="Roboto Mono" w:hAnsi="Roboto Mono"/>
+        </w:rPr>
+        <w:t xml:space="preserve">also passes through </w:t>
+      </w:r>
+      <m:oMath>
+        <m:r>
+          <w:rPr>
+            <w:rFonts w:ascii="Cambria Math" w:hAnsi="Cambria Math"/>
+          </w:rPr>
+          <m:t>I</m:t>
+        </m:r>
+      </m:oMath>
+      <w:r>
+        <w:rPr>
+          <w:rFonts w:ascii="Roboto Mono" w:hAnsi="Roboto Mono"/>
+        </w:rPr>
+        <w:t xml:space="preserve">. </w:t>
+      </w:r>
+    </w:p>
+    <w:p>
+      <w:pPr>
+        <w:rPr>
+          <w:rFonts w:ascii="Roboto Mono" w:hAnsi="Roboto Mono"/>
+        </w:rPr>
+      </w:pPr>
+      <w:r>
+        <w:rPr>
+          <w:rFonts w:ascii="Roboto Mono" w:hAnsi="Roboto Mono"/>
+        </w:rPr>
+        <w:t>Thus:</w:t>
+      </w:r>
+    </w:p>
+    <w:p>
+      <w:pPr>
+        <w:rPr>
+          <w:rFonts w:ascii="Roboto Mono" w:hAnsi="Roboto Mono"/>
+        </w:rPr>
+      </w:pPr>
+      <m:oMathPara>
+        <m:oMath>
+          <m:borderBox>
+            <m:borderBoxPr>
+              <m:ctrlPr>
+                <w:rPr>
+                  <w:rFonts w:ascii="Cambria Math" w:hAnsi="Cambria Math"/>
+                </w:rPr>
+              </m:ctrlPr>
+            </m:borderBoxPr>
+            <m:e>
+              <m:r>
+                <w:rPr>
+                  <w:rFonts w:ascii="Cambria Math" w:hAnsi="Cambria Math"/>
+                </w:rPr>
+                <m:t>I=</m:t>
+              </m:r>
+              <m:r>
+                <m:rPr>
+                  <m:nor/>
+                </m:rPr>
+                <w:rPr>
+                  <w:rFonts w:ascii="Roboto Mono" w:hAnsi="Roboto Mono"/>
+                </w:rPr>
+                <m:t>intersection of the three internal angle bisectors</m:t>
+              </m:r>
+            </m:e>
+          </m:borderBox>
+          <m:r>
+            <w:rPr>
+              <w:rFonts w:ascii="Roboto Mono" w:hAnsi="Roboto Mono"/>
+            </w:rPr>
+            <w:br/>
+          </m:r>
+        </m:oMath>
+      </m:oMathPara>
+    </w:p>
+    <w:p>
+      <w:pPr>
+        <w:rPr>
+          <w:rFonts w:ascii="Roboto Mono" w:hAnsi="Roboto Mono"/>
+          <w:b/>
+          <w:bCs/>
+        </w:rPr>
+      </w:pPr>
+      <w:r>
+        <w:rPr>
+          <w:rFonts w:ascii="Roboto Mono" w:hAnsi="Roboto Mono"/>
+          <w:b/>
+          <w:bCs/>
+        </w:rPr>
+        <w:t>Equality Produced by the Construction</w:t>
+      </w:r>
+    </w:p>
+    <w:p>
+      <w:pPr>
+        <w:rPr>
+          <w:rFonts w:ascii="Roboto Mono" w:hAnsi="Roboto Mono"/>
+        </w:rPr>
+      </w:pPr>
+      <w:r>
+        <w:rPr>
+          <w:rFonts w:ascii="Roboto Mono" w:hAnsi="Roboto Mono"/>
+        </w:rPr>
+        <w:t xml:space="preserve">At vertex </w:t>
+      </w:r>
+      <m:oMath>
+        <m:r>
+          <w:rPr>
+            <w:rFonts w:ascii="Cambria Math" w:hAnsi="Cambria Math"/>
+          </w:rPr>
+          <m:t>A</m:t>
+        </m:r>
+      </m:oMath>
+      <w:r>
+        <w:rPr>
+          <w:rFonts w:ascii="Roboto Mono" w:hAnsi="Roboto Mono"/>
+        </w:rPr>
+        <w:t>:</w:t>
+      </w:r>
+    </w:p>
+    <w:p>
+      <w:pPr>
+        <w:rPr>
+          <w:rFonts w:ascii="Roboto Mono" w:hAnsi="Roboto Mono"/>
+        </w:rPr>
+      </w:pPr>
+      <m:oMathPara>
+        <m:oMath>
+          <m:borderBox>
+            <m:borderBoxPr>
+              <m:ctrlPr>
+                <w:rPr>
+                  <w:rFonts w:ascii="Cambria Math" w:hAnsi="Cambria Math"/>
+                </w:rPr>
+              </m:ctrlPr>
+            </m:borderBoxPr>
+            <m:e>
+              <m:r>
+                <w:rPr>
+                  <w:rFonts w:ascii="Cambria Math" w:hAnsi="Cambria Math"/>
+                </w:rPr>
+                <m:t>∠BAI=∠IAC</m:t>
+              </m:r>
+            </m:e>
+          </m:borderBox>
+          <m:r>
+            <w:rPr>
+              <w:rFonts w:ascii="Roboto Mono" w:hAnsi="Roboto Mono"/>
+            </w:rPr>
+            <w:br/>
+          </m:r>
+        </m:oMath>
+      </m:oMathPara>
+    </w:p>
+    <w:p>
+      <w:pPr>
+        <w:rPr>
+          <w:rFonts w:ascii="Roboto Mono" w:hAnsi="Roboto Mono"/>
+        </w:rPr>
+      </w:pPr>
+      <w:r>
+        <w:rPr>
+          <w:rFonts w:ascii="Roboto Mono" w:hAnsi="Roboto Mono"/>
+        </w:rPr>
+        <w:t xml:space="preserve">At vertex </w:t>
+      </w:r>
+      <m:oMath>
+        <m:r>
+          <w:rPr>
+            <w:rFonts w:ascii="Cambria Math" w:hAnsi="Cambria Math"/>
+          </w:rPr>
+          <m:t>B</m:t>
+        </m:r>
+      </m:oMath>
+      <w:r>
+        <w:rPr>
+          <w:rFonts w:ascii="Roboto Mono" w:hAnsi="Roboto Mono"/>
+        </w:rPr>
+        <w:t>:</w:t>
+      </w:r>
+    </w:p>
+    <w:p>
+      <w:pPr>
+        <w:rPr>
+          <w:rFonts w:ascii="Roboto Mono" w:hAnsi="Roboto Mono"/>
+        </w:rPr>
+      </w:pPr>
+      <m:oMathPara>
+        <m:oMath>
+          <m:borderBox>
+            <m:borderBoxPr>
+              <m:ctrlPr>
+                <w:rPr>
+                  <w:rFonts w:ascii="Cambria Math" w:hAnsi="Cambria Math"/>
+                </w:rPr>
+              </m:ctrlPr>
+            </m:borderBoxPr>
+            <m:e>
+              <m:r>
+                <w:rPr>
+                  <w:rFonts w:ascii="Cambria Math" w:hAnsi="Cambria Math"/>
+                </w:rPr>
+                <m:t>∠ABI=∠IBC</m:t>
+              </m:r>
+            </m:e>
+          </m:borderBox>
+          <m:r>
+            <w:rPr>
+              <w:rFonts w:ascii="Roboto Mono" w:hAnsi="Roboto Mono"/>
+            </w:rPr>
+            <w:br/>
+          </m:r>
+        </m:oMath>
+      </m:oMathPara>
+    </w:p>
+    <w:p>
+      <w:pPr>
+        <w:rPr>
+          <w:rFonts w:ascii="Roboto Mono" w:hAnsi="Roboto Mono"/>
+        </w:rPr>
+      </w:pPr>
+      <w:r>
+        <w:rPr>
+          <w:rFonts w:ascii="Roboto Mono" w:hAnsi="Roboto Mono"/>
+        </w:rPr>
+        <w:t xml:space="preserve">At vertex </w:t>
+      </w:r>
+      <m:oMath>
+        <m:r>
+          <w:rPr>
+            <w:rFonts w:ascii="Cambria Math" w:hAnsi="Cambria Math"/>
+          </w:rPr>
+          <m:t>C</m:t>
+        </m:r>
+      </m:oMath>
+      <w:r>
+        <w:rPr>
+          <w:rFonts w:ascii="Roboto Mono" w:hAnsi="Roboto Mono"/>
+        </w:rPr>
+        <w:t>:</w:t>
+      </w:r>
+    </w:p>
+    <w:p>
+      <w:pPr>
+        <w:rPr>
+          <w:rFonts w:ascii="Roboto Mono" w:hAnsi="Roboto Mono"/>
+        </w:rPr>
+      </w:pPr>
+      <m:oMathPara>
+        <m:oMath>
+          <m:borderBox>
+            <m:borderBoxPr>
+              <m:ctrlPr>
+                <w:rPr>
+                  <w:rFonts w:ascii="Cambria Math" w:hAnsi="Cambria Math"/>
+                </w:rPr>
+              </m:ctrlPr>
+            </m:borderBoxPr>
+            <m:e>
+              <m:r>
+                <w:rPr>
+                  <w:rFonts w:ascii="Cambria Math" w:hAnsi="Cambria Math"/>
+                </w:rPr>
+                <m:t>∠ACI=∠ICB</m:t>
+              </m:r>
+            </m:e>
+          </m:borderBox>
+          <m:r>
+            <w:rPr>
+              <w:rFonts w:ascii="Roboto Mono" w:hAnsi="Roboto Mono"/>
+            </w:rPr>
+            <w:br/>
+          </m:r>
+        </m:oMath>
+      </m:oMathPara>
+    </w:p>
+    <w:p>
+      <w:pPr>
+        <w:rPr>
+          <w:rFonts w:ascii="Roboto Mono" w:hAnsi="Roboto Mono"/>
+        </w:rPr>
+      </w:pPr>
+      <w:r>
+        <w:rPr>
+          <w:rFonts w:ascii="Roboto Mono" w:hAnsi="Roboto Mono"/>
+        </w:rPr>
+        <w:t xml:space="preserve">Therefore, the construction creates several instances of </w:t>
+      </w:r>
+      <w:r>
+        <w:rPr>
+          <w:rFonts w:ascii="Roboto Mono" w:hAnsi="Roboto Mono"/>
+          <w:b/>
+          <w:bCs/>
+        </w:rPr>
+        <w:t>Angle Equality</w:t>
+      </w:r>
+      <w:r>
+        <w:rPr>
+          <w:rFonts w:ascii="Roboto Mono" w:hAnsi="Roboto Mono"/>
+        </w:rPr>
+        <w:t>.</w:t>
+      </w:r>
+    </w:p>
+    <w:p>
+      <w:pPr>
+        <w:rPr>
+          <w:rFonts w:ascii="Roboto Mono" w:hAnsi="Roboto Mono"/>
+          <w:b/>
+          <w:bCs/>
+        </w:rPr>
+      </w:pPr>
+      <w:r>
+        <w:rPr>
+          <w:rFonts w:ascii="Roboto Mono" w:hAnsi="Roboto Mono"/>
+          <w:b/>
+          <w:bCs/>
+        </w:rPr>
+        <w:t>Equal-Distance Property</w:t>
+      </w:r>
+    </w:p>
+    <w:p>
+      <w:pPr>
+        <w:rPr>
+          <w:rFonts w:ascii="Roboto Mono" w:hAnsi="Roboto Mono"/>
+        </w:rPr>
+      </w:pPr>
+      <w:r>
+        <w:rPr>
+          <w:rFonts w:ascii="Roboto Mono" w:hAnsi="Roboto Mono"/>
+        </w:rPr>
+        <w:t xml:space="preserve">Drop perpendiculars from </w:t>
+      </w:r>
+      <m:oMath>
+        <m:r>
+          <w:rPr>
+            <w:rFonts w:ascii="Cambria Math" w:hAnsi="Cambria Math"/>
+          </w:rPr>
+          <m:t>I</m:t>
+        </m:r>
+      </m:oMath>
+      <w:r>
+        <w:rPr>
+          <w:rFonts w:ascii="Roboto Mono" w:hAnsi="Roboto Mono"/>
+        </w:rPr>
+        <w:t>to the three sides:</w:t>
+      </w:r>
+    </w:p>
+    <w:p>
+      <w:pPr>
+        <w:rPr>
+          <w:rFonts w:ascii="Roboto Mono" w:hAnsi="Roboto Mono"/>
+        </w:rPr>
+      </w:pPr>
+      <m:oMathPara>
+        <m:oMath>
+          <m:r>
+            <w:rPr>
+              <w:rFonts w:ascii="Cambria Math" w:hAnsi="Cambria Math"/>
+            </w:rPr>
+            <m:t>ID⊥AB, IE⊥BC, IF⊥CA.</m:t>
+          </m:r>
+          <m:r>
+            <w:rPr>
+              <w:rFonts w:ascii="Roboto Mono" w:hAnsi="Roboto Mono"/>
+              <w:i/>
+            </w:rPr>
+            <w:br/>
+          </m:r>
+        </m:oMath>
+      </m:oMathPara>
+    </w:p>
+    <w:p>
+      <w:pPr>
+        <w:rPr>
+          <w:rFonts w:ascii="Roboto Mono" w:hAnsi="Roboto Mono"/>
+        </w:rPr>
+      </w:pPr>
+      <w:r>
+        <w:rPr>
+          <w:rFonts w:ascii="Roboto Mono" w:hAnsi="Roboto Mono"/>
+        </w:rPr>
+        <w:t>Then:</w:t>
+      </w:r>
+    </w:p>
+    <w:p>
+      <w:pPr>
+        <w:rPr>
+          <w:rFonts w:ascii="Roboto Mono" w:hAnsi="Roboto Mono"/>
+        </w:rPr>
+      </w:pPr>
+      <m:oMathPara>
+        <m:oMath>
+          <m:borderBox>
+            <m:borderBoxPr>
+              <m:ctrlPr>
+                <w:rPr>
+                  <w:rFonts w:ascii="Cambria Math" w:hAnsi="Cambria Math"/>
+                </w:rPr>
+              </m:ctrlPr>
+            </m:borderBoxPr>
+            <m:e>
+              <m:r>
+                <w:rPr>
+                  <w:rFonts w:ascii="Cambria Math" w:hAnsi="Cambria Math"/>
+                </w:rPr>
+                <m:t>ID=IE=IF</m:t>
+              </m:r>
+            </m:e>
+          </m:borderBox>
+          <m:r>
+            <w:rPr>
+              <w:rFonts w:ascii="Roboto Mono" w:hAnsi="Roboto Mono"/>
+            </w:rPr>
+            <w:br/>
+          </m:r>
+        </m:oMath>
+      </m:oMathPara>
+    </w:p>
+    <w:p>
+      <w:pPr>
+        <w:rPr>
+          <w:rFonts w:ascii="Roboto Mono" w:hAnsi="Roboto Mono"/>
+        </w:rPr>
+      </w:pPr>
+      <w:r>
+        <w:rPr>
+          <w:rFonts w:ascii="Roboto Mono" w:hAnsi="Roboto Mono"/>
+        </w:rPr>
+        <w:t xml:space="preserve">Therefore, the incenter is also the center of the circle tangent to all three sides of the triangle—the </w:t>
+      </w:r>
+      <w:r>
+        <w:rPr>
+          <w:rFonts w:ascii="Roboto Mono" w:hAnsi="Roboto Mono"/>
+          <w:b/>
+          <w:bCs/>
+        </w:rPr>
+        <w:t>incircle</w:t>
+      </w:r>
+      <w:r>
+        <w:rPr>
+          <w:rFonts w:ascii="Roboto Mono" w:hAnsi="Roboto Mono"/>
+        </w:rPr>
+        <w:t>.</w:t>
+      </w:r>
+    </w:p>
+    <w:p>
+      <w:pPr>
         <w:rPr>
           <w:rFonts w:ascii="Roboto Mono" w:hAnsi="Roboto Mono"/>
         </w:rPr>
@@ -3393,7 +4459,7 @@
           <w:rFonts w:ascii="Roboto Mono" w:hAnsi="Roboto Mono"/>
         </w:rPr>
         <w:pict w14:anchorId="4EF0B417">
-          <v:rect id="_x0000_i1090" style="width:0;height:1.5pt" o:hralign="center" o:hrstd="t" o:hr="t" fillcolor="#a0a0a0" stroked="f"/>
+          <v:rect id="_x0000_i1030" style="width:0;height:1.5pt" o:hralign="center" o:hrstd="t" o:hr="t" fillcolor="#a0a0a0" stroked="f"/>
         </w:pict>
       </w:r>
     </w:p>
@@ -3953,7 +5019,7 @@
           <w:rFonts w:ascii="Roboto Mono" w:hAnsi="Roboto Mono"/>
         </w:rPr>
         <w:pict w14:anchorId="0339C015">
-          <v:rect id="_x0000_i1091" style="width:0;height:1.5pt" o:hralign="center" o:hrstd="t" o:hr="t" fillcolor="#a0a0a0" stroked="f"/>
+          <v:rect id="_x0000_i1031" style="width:0;height:1.5pt" o:hralign="center" o:hrstd="t" o:hr="t" fillcolor="#a0a0a0" stroked="f"/>
         </w:pict>
       </w:r>
     </w:p>
@@ -4571,7 +5637,7 @@
         </w:rPr>
         <w:lastRenderedPageBreak/>
         <w:pict w14:anchorId="598AA46B">
-          <v:rect id="_x0000_i1092" style="width:0;height:1.5pt" o:hralign="center" o:hrstd="t" o:hr="t" fillcolor="#a0a0a0" stroked="f"/>
+          <v:rect id="_x0000_i1032" style="width:0;height:1.5pt" o:hralign="center" o:hrstd="t" o:hr="t" fillcolor="#a0a0a0" stroked="f"/>
         </w:pict>
       </w:r>
     </w:p>
@@ -4992,7 +6058,7 @@
           <w:rFonts w:ascii="Roboto Mono" w:hAnsi="Roboto Mono"/>
         </w:rPr>
         <w:pict w14:anchorId="36D27EF5">
-          <v:rect id="_x0000_i1093" style="width:0;height:1.5pt" o:hralign="center" o:hrstd="t" o:hr="t" fillcolor="#a0a0a0" stroked="f"/>
+          <v:rect id="_x0000_i1033" style="width:0;height:1.5pt" o:hralign="center" o:hrstd="t" o:hr="t" fillcolor="#a0a0a0" stroked="f"/>
         </w:pict>
       </w:r>
     </w:p>
@@ -5100,6 +6166,9 @@
             <m:t> cm</m:t>
           </m:r>
           <m:r>
+            <m:rPr>
+              <m:sty m:val="p"/>
+            </m:rPr>
             <w:rPr>
               <w:rFonts w:ascii="Roboto Mono" w:hAnsi="Roboto Mono"/>
             </w:rPr>
@@ -5123,6 +6192,9 @@
             <m:t> cm</m:t>
           </m:r>
           <m:r>
+            <m:rPr>
+              <m:sty m:val="p"/>
+            </m:rPr>
             <w:rPr>
               <w:rFonts w:ascii="Roboto Mono" w:hAnsi="Roboto Mono"/>
             </w:rPr>
@@ -6392,7 +7464,7 @@
           <w:rFonts w:ascii="Roboto Mono" w:hAnsi="Roboto Mono"/>
         </w:rPr>
         <w:pict w14:anchorId="445D3E91">
-          <v:rect id="_x0000_i1094" style="width:0;height:1.5pt" o:hralign="center" o:hrstd="t" o:hr="t" fillcolor="#a0a0a0" stroked="f"/>
+          <v:rect id="_x0000_i1034" style="width:0;height:1.5pt" o:hralign="center" o:hrstd="t" o:hr="t" fillcolor="#a0a0a0" stroked="f"/>
         </w:pict>
       </w:r>
     </w:p>
@@ -8903,6 +9975,119 @@
     </w:lvl>
   </w:abstractNum>
   <w:abstractNum w:abstractNumId="12" w15:restartNumberingAfterBreak="0">
+    <w:nsid w:val="49E7575F"/>
+    <w:multiLevelType w:val="multilevel"/>
+    <w:tmpl w:val="40DE0980"/>
+    <w:lvl w:ilvl="0">
+      <w:start w:val="1"/>
+      <w:numFmt w:val="decimal"/>
+      <w:lvlText w:val="%1."/>
+      <w:lvlJc w:val="left"/>
+      <w:pPr>
+        <w:tabs>
+          <w:tab w:val="num" w:pos="720"/>
+        </w:tabs>
+        <w:ind w:left="720" w:hanging="360"/>
+      </w:pPr>
+    </w:lvl>
+    <w:lvl w:ilvl="1" w:tentative="1">
+      <w:start w:val="1"/>
+      <w:numFmt w:val="decimal"/>
+      <w:lvlText w:val="%2."/>
+      <w:lvlJc w:val="left"/>
+      <w:pPr>
+        <w:tabs>
+          <w:tab w:val="num" w:pos="1440"/>
+        </w:tabs>
+        <w:ind w:left="1440" w:hanging="360"/>
+      </w:pPr>
+    </w:lvl>
+    <w:lvl w:ilvl="2" w:tentative="1">
+      <w:start w:val="1"/>
+      <w:numFmt w:val="decimal"/>
+      <w:lvlText w:val="%3."/>
+      <w:lvlJc w:val="left"/>
+      <w:pPr>
+        <w:tabs>
+          <w:tab w:val="num" w:pos="2160"/>
+        </w:tabs>
+        <w:ind w:left="2160" w:hanging="360"/>
+      </w:pPr>
+    </w:lvl>
+    <w:lvl w:ilvl="3" w:tentative="1">
+      <w:start w:val="1"/>
+      <w:numFmt w:val="decimal"/>
+      <w:lvlText w:val="%4."/>
+      <w:lvlJc w:val="left"/>
+      <w:pPr>
+        <w:tabs>
+          <w:tab w:val="num" w:pos="2880"/>
+        </w:tabs>
+        <w:ind w:left="2880" w:hanging="360"/>
+      </w:pPr>
+    </w:lvl>
+    <w:lvl w:ilvl="4" w:tentative="1">
+      <w:start w:val="1"/>
+      <w:numFmt w:val="decimal"/>
+      <w:lvlText w:val="%5."/>
+      <w:lvlJc w:val="left"/>
+      <w:pPr>
+        <w:tabs>
+          <w:tab w:val="num" w:pos="3600"/>
+        </w:tabs>
+        <w:ind w:left="3600" w:hanging="360"/>
+      </w:pPr>
+    </w:lvl>
+    <w:lvl w:ilvl="5" w:tentative="1">
+      <w:start w:val="1"/>
+      <w:numFmt w:val="decimal"/>
+      <w:lvlText w:val="%6."/>
+      <w:lvlJc w:val="left"/>
+      <w:pPr>
+        <w:tabs>
+          <w:tab w:val="num" w:pos="4320"/>
+        </w:tabs>
+        <w:ind w:left="4320" w:hanging="360"/>
+      </w:pPr>
+    </w:lvl>
+    <w:lvl w:ilvl="6" w:tentative="1">
+      <w:start w:val="1"/>
+      <w:numFmt w:val="decimal"/>
+      <w:lvlText w:val="%7."/>
+      <w:lvlJc w:val="left"/>
+      <w:pPr>
+        <w:tabs>
+          <w:tab w:val="num" w:pos="5040"/>
+        </w:tabs>
+        <w:ind w:left="5040" w:hanging="360"/>
+      </w:pPr>
+    </w:lvl>
+    <w:lvl w:ilvl="7" w:tentative="1">
+      <w:start w:val="1"/>
+      <w:numFmt w:val="decimal"/>
+      <w:lvlText w:val="%8."/>
+      <w:lvlJc w:val="left"/>
+      <w:pPr>
+        <w:tabs>
+          <w:tab w:val="num" w:pos="5760"/>
+        </w:tabs>
+        <w:ind w:left="5760" w:hanging="360"/>
+      </w:pPr>
+    </w:lvl>
+    <w:lvl w:ilvl="8" w:tentative="1">
+      <w:start w:val="1"/>
+      <w:numFmt w:val="decimal"/>
+      <w:lvlText w:val="%9."/>
+      <w:lvlJc w:val="left"/>
+      <w:pPr>
+        <w:tabs>
+          <w:tab w:val="num" w:pos="6480"/>
+        </w:tabs>
+        <w:ind w:left="6480" w:hanging="360"/>
+      </w:pPr>
+    </w:lvl>
+  </w:abstractNum>
+  <w:abstractNum w:abstractNumId="13" w15:restartNumberingAfterBreak="0">
     <w:nsid w:val="50AC0A65"/>
     <w:multiLevelType w:val="multilevel"/>
     <w:tmpl w:val="D280EDF4"/>
@@ -9051,7 +10236,7 @@
       </w:rPr>
     </w:lvl>
   </w:abstractNum>
-  <w:abstractNum w:abstractNumId="13" w15:restartNumberingAfterBreak="0">
+  <w:abstractNum w:abstractNumId="14" w15:restartNumberingAfterBreak="0">
     <w:nsid w:val="51DD5F69"/>
     <w:multiLevelType w:val="multilevel"/>
     <w:tmpl w:val="0FDA90BA"/>
@@ -9164,7 +10349,7 @@
       </w:pPr>
     </w:lvl>
   </w:abstractNum>
-  <w:abstractNum w:abstractNumId="14" w15:restartNumberingAfterBreak="0">
+  <w:abstractNum w:abstractNumId="15" w15:restartNumberingAfterBreak="0">
     <w:nsid w:val="535830F8"/>
     <w:multiLevelType w:val="multilevel"/>
     <w:tmpl w:val="ACF0DEE8"/>
@@ -9277,7 +10462,7 @@
       </w:pPr>
     </w:lvl>
   </w:abstractNum>
-  <w:abstractNum w:abstractNumId="15" w15:restartNumberingAfterBreak="0">
+  <w:abstractNum w:abstractNumId="16" w15:restartNumberingAfterBreak="0">
     <w:nsid w:val="57702BDB"/>
     <w:multiLevelType w:val="multilevel"/>
     <w:tmpl w:val="504AA67A"/>
@@ -9390,7 +10575,7 @@
       </w:pPr>
     </w:lvl>
   </w:abstractNum>
-  <w:abstractNum w:abstractNumId="16" w15:restartNumberingAfterBreak="0">
+  <w:abstractNum w:abstractNumId="17" w15:restartNumberingAfterBreak="0">
     <w:nsid w:val="60236B8F"/>
     <w:multiLevelType w:val="multilevel"/>
     <w:tmpl w:val="396EA890"/>
@@ -9539,7 +10724,7 @@
       </w:rPr>
     </w:lvl>
   </w:abstractNum>
-  <w:abstractNum w:abstractNumId="17" w15:restartNumberingAfterBreak="0">
+  <w:abstractNum w:abstractNumId="18" w15:restartNumberingAfterBreak="0">
     <w:nsid w:val="62BC0CED"/>
     <w:multiLevelType w:val="multilevel"/>
     <w:tmpl w:val="453C624E"/>
@@ -9652,7 +10837,7 @@
       </w:pPr>
     </w:lvl>
   </w:abstractNum>
-  <w:abstractNum w:abstractNumId="18" w15:restartNumberingAfterBreak="0">
+  <w:abstractNum w:abstractNumId="19" w15:restartNumberingAfterBreak="0">
     <w:nsid w:val="63533EE3"/>
     <w:multiLevelType w:val="multilevel"/>
     <w:tmpl w:val="78C6D012"/>
@@ -9765,7 +10950,7 @@
       </w:pPr>
     </w:lvl>
   </w:abstractNum>
-  <w:abstractNum w:abstractNumId="19" w15:restartNumberingAfterBreak="0">
+  <w:abstractNum w:abstractNumId="20" w15:restartNumberingAfterBreak="0">
     <w:nsid w:val="6CCF7F32"/>
     <w:multiLevelType w:val="multilevel"/>
     <w:tmpl w:val="DF182256"/>
@@ -9878,7 +11063,7 @@
       </w:pPr>
     </w:lvl>
   </w:abstractNum>
-  <w:abstractNum w:abstractNumId="20" w15:restartNumberingAfterBreak="0">
+  <w:abstractNum w:abstractNumId="21" w15:restartNumberingAfterBreak="0">
     <w:nsid w:val="72E74733"/>
     <w:multiLevelType w:val="multilevel"/>
     <w:tmpl w:val="72BC2E4C"/>
@@ -10027,7 +11212,7 @@
       </w:rPr>
     </w:lvl>
   </w:abstractNum>
-  <w:abstractNum w:abstractNumId="21" w15:restartNumberingAfterBreak="0">
+  <w:abstractNum w:abstractNumId="22" w15:restartNumberingAfterBreak="0">
     <w:nsid w:val="74650908"/>
     <w:multiLevelType w:val="multilevel"/>
     <w:tmpl w:val="3BFEE99A"/>
@@ -10140,7 +11325,7 @@
       </w:pPr>
     </w:lvl>
   </w:abstractNum>
-  <w:abstractNum w:abstractNumId="22" w15:restartNumberingAfterBreak="0">
+  <w:abstractNum w:abstractNumId="23" w15:restartNumberingAfterBreak="0">
     <w:nsid w:val="7A502090"/>
     <w:multiLevelType w:val="multilevel"/>
     <w:tmpl w:val="D1D6ACE0"/>
@@ -10296,25 +11481,25 @@
     <w:abstractNumId w:val="4"/>
   </w:num>
   <w:num w:numId="3" w16cid:durableId="1754620461">
-    <w:abstractNumId w:val="13"/>
+    <w:abstractNumId w:val="14"/>
   </w:num>
   <w:num w:numId="4" w16cid:durableId="1337877968">
     <w:abstractNumId w:val="3"/>
   </w:num>
   <w:num w:numId="5" w16cid:durableId="1639261352">
-    <w:abstractNumId w:val="18"/>
+    <w:abstractNumId w:val="19"/>
   </w:num>
   <w:num w:numId="6" w16cid:durableId="1729919643">
     <w:abstractNumId w:val="6"/>
   </w:num>
   <w:num w:numId="7" w16cid:durableId="205483490">
-    <w:abstractNumId w:val="14"/>
+    <w:abstractNumId w:val="15"/>
   </w:num>
   <w:num w:numId="8" w16cid:durableId="1637024895">
-    <w:abstractNumId w:val="17"/>
+    <w:abstractNumId w:val="18"/>
   </w:num>
   <w:num w:numId="9" w16cid:durableId="1287661772">
-    <w:abstractNumId w:val="19"/>
+    <w:abstractNumId w:val="20"/>
   </w:num>
   <w:num w:numId="10" w16cid:durableId="17826314">
     <w:abstractNumId w:val="7"/>
@@ -10326,16 +11511,16 @@
     <w:abstractNumId w:val="10"/>
   </w:num>
   <w:num w:numId="13" w16cid:durableId="1272736690">
-    <w:abstractNumId w:val="20"/>
+    <w:abstractNumId w:val="21"/>
   </w:num>
   <w:num w:numId="14" w16cid:durableId="149756093">
     <w:abstractNumId w:val="8"/>
   </w:num>
   <w:num w:numId="15" w16cid:durableId="447041364">
-    <w:abstractNumId w:val="12"/>
+    <w:abstractNumId w:val="13"/>
   </w:num>
   <w:num w:numId="16" w16cid:durableId="1017347559">
-    <w:abstractNumId w:val="22"/>
+    <w:abstractNumId w:val="23"/>
   </w:num>
   <w:num w:numId="17" w16cid:durableId="1432359230">
     <w:abstractNumId w:val="11"/>
@@ -10344,19 +11529,22 @@
     <w:abstractNumId w:val="2"/>
   </w:num>
   <w:num w:numId="19" w16cid:durableId="573667095">
-    <w:abstractNumId w:val="15"/>
+    <w:abstractNumId w:val="16"/>
   </w:num>
   <w:num w:numId="20" w16cid:durableId="678393254">
-    <w:abstractNumId w:val="21"/>
+    <w:abstractNumId w:val="22"/>
   </w:num>
   <w:num w:numId="21" w16cid:durableId="65035852">
     <w:abstractNumId w:val="0"/>
   </w:num>
   <w:num w:numId="22" w16cid:durableId="153574380">
-    <w:abstractNumId w:val="16"/>
+    <w:abstractNumId w:val="17"/>
   </w:num>
   <w:num w:numId="23" w16cid:durableId="1284068928">
     <w:abstractNumId w:val="5"/>
+  </w:num>
+  <w:num w:numId="24" w16cid:durableId="1569613700">
+    <w:abstractNumId w:val="12"/>
   </w:num>
 </w:numbering>
 </file>

</xml_diff>

<commit_message>
Science - 10/2/2026 part 2
</commit_message>
<xml_diff>
--- a/1-Formal sciences/1-Mathematics/3-Pure Mathematics/3-Space/2-Euclidean Geometry/5-My Source/1-Plane Geometry/20-Types of Geometric Construction/11-Constructing Triangle.docx
+++ b/1-Formal sciences/1-Mathematics/3-Pure Mathematics/3-Space/2-Euclidean Geometry/5-My Source/1-Plane Geometry/20-Types of Geometric Construction/11-Constructing Triangle.docx
@@ -3386,1081 +3386,6 @@
           <w:rFonts w:ascii="Roboto Mono" w:hAnsi="Roboto Mono"/>
         </w:rPr>
         <w:t>The resulting triangle is a right triangle.</w:t>
-      </w:r>
-    </w:p>
-    <w:p>
-      <w:pPr>
-        <w:pStyle w:val="Heading3"/>
-      </w:pPr>
-      <w:r>
-        <w:t xml:space="preserve">6. </w:t>
-      </w:r>
-      <w:r>
-        <w:t>Incenter Construction</w:t>
-      </w:r>
-    </w:p>
-    <w:p>
-      <w:pPr>
-        <w:rPr>
-          <w:rFonts w:ascii="Arial" w:eastAsia="Arial" w:hAnsi="Arial" w:cs="Arial"/>
-          <w:color w:val="000000"/>
-          <w:sz w:val="18"/>
-        </w:rPr>
-      </w:pPr>
-      <w:r>
-        <w:rPr>
-          <w:rFonts w:ascii="Arial" w:eastAsia="Arial" w:hAnsi="Arial" w:cs="Arial"/>
-          <w:b/>
-          <w:color w:val="000000"/>
-          <w:sz w:val="18"/>
-          <w:highlight w:val="lightGray"/>
-        </w:rPr>
-        <w:t># Source: AI Source: Provided by: [Data Path</w:t>
-      </w:r>
-      <w:r>
-        <w:rPr>
-          <w:rFonts w:ascii="Arial" w:eastAsia="Arial" w:hAnsi="Arial" w:cs="Arial"/>
-          <w:color w:val="000000"/>
-          <w:sz w:val="18"/>
-          <w:highlight w:val="lightGray"/>
-        </w:rPr>
-        <w:t xml:space="preserve">: Persons Table -&gt; ID Column: 1, Name_En Column: Motasem Essam] -&gt; </w:t>
-      </w:r>
-      <w:r>
-        <w:rPr>
-          <w:rFonts w:ascii="Arial" w:eastAsia="Arial" w:hAnsi="Arial" w:cs="Arial"/>
-          <w:b/>
-          <w:color w:val="000000"/>
-          <w:sz w:val="18"/>
-          <w:highlight w:val="lightGray"/>
-        </w:rPr>
-        <w:t>From:</w:t>
-      </w:r>
-      <w:r>
-        <w:rPr>
-          <w:rFonts w:ascii="Arial" w:eastAsia="Arial" w:hAnsi="Arial" w:cs="Arial"/>
-          <w:color w:val="000000"/>
-          <w:sz w:val="18"/>
-          <w:highlight w:val="lightGray"/>
-        </w:rPr>
-        <w:t xml:space="preserve"> [ChatGPT] </w:t>
-      </w:r>
-      <w:r>
-        <w:rPr>
-          <w:rFonts w:ascii="Arial" w:eastAsia="Arial" w:hAnsi="Arial" w:cs="Arial"/>
-          <w:b/>
-          <w:color w:val="000000"/>
-          <w:sz w:val="18"/>
-          <w:highlight w:val="lightGray"/>
-        </w:rPr>
-        <w:t>on</w:t>
-      </w:r>
-      <w:r>
-        <w:rPr>
-          <w:rFonts w:ascii="Arial" w:eastAsia="Arial" w:hAnsi="Arial" w:cs="Arial"/>
-          <w:color w:val="000000"/>
-          <w:sz w:val="18"/>
-          <w:highlight w:val="lightGray"/>
-        </w:rPr>
-        <w:t xml:space="preserve"> [7/25/2026]</w:t>
-      </w:r>
-    </w:p>
-    <w:p>
-      <w:pPr>
-        <w:rPr>
-          <w:rFonts w:ascii="Roboto Mono" w:hAnsi="Roboto Mono"/>
-          <w:b/>
-          <w:bCs/>
-        </w:rPr>
-      </w:pPr>
-      <w:r>
-        <w:rPr>
-          <w:rFonts w:ascii="Roboto Mono" w:hAnsi="Roboto Mono"/>
-          <w:b/>
-          <w:bCs/>
-        </w:rPr>
-        <w:t>Definition</w:t>
-      </w:r>
-    </w:p>
-    <w:p>
-      <w:pPr>
-        <w:rPr>
-          <w:rFonts w:ascii="Roboto Mono" w:hAnsi="Roboto Mono"/>
-        </w:rPr>
-      </w:pPr>
-      <w:r>
-        <w:rPr>
-          <w:rFonts w:ascii="Roboto Mono" w:hAnsi="Roboto Mono"/>
-          <w:b/>
-          <w:bCs/>
-        </w:rPr>
-        <w:t>Incenter Construction</w:t>
-      </w:r>
-      <w:r>
-        <w:rPr>
-          <w:rFonts w:ascii="Roboto Mono" w:hAnsi="Roboto Mono"/>
-        </w:rPr>
-        <w:t xml:space="preserve"> is the construction of the </w:t>
-      </w:r>
-      <w:r>
-        <w:rPr>
-          <w:rFonts w:ascii="Roboto Mono" w:hAnsi="Roboto Mono"/>
-          <w:b/>
-          <w:bCs/>
-        </w:rPr>
-        <w:t>incenter</w:t>
-      </w:r>
-      <w:r>
-        <w:rPr>
-          <w:rFonts w:ascii="Roboto Mono" w:hAnsi="Roboto Mono"/>
-        </w:rPr>
-        <w:t xml:space="preserve"> of a triangle by constructing its three angle bisectors.</w:t>
-      </w:r>
-    </w:p>
-    <w:p>
-      <w:pPr>
-        <w:rPr>
-          <w:rFonts w:ascii="Roboto Mono" w:hAnsi="Roboto Mono"/>
-        </w:rPr>
-      </w:pPr>
-      <w:r>
-        <w:rPr>
-          <w:rFonts w:ascii="Roboto Mono" w:hAnsi="Roboto Mono"/>
-        </w:rPr>
-        <w:t xml:space="preserve">The three internal angle bisectors of a triangle intersect at one common point called the </w:t>
-      </w:r>
-      <w:r>
-        <w:rPr>
-          <w:rFonts w:ascii="Roboto Mono" w:hAnsi="Roboto Mono"/>
-          <w:b/>
-          <w:bCs/>
-        </w:rPr>
-        <w:t>incenter</w:t>
-      </w:r>
-      <w:r>
-        <w:rPr>
-          <w:rFonts w:ascii="Roboto Mono" w:hAnsi="Roboto Mono"/>
-        </w:rPr>
-        <w:t xml:space="preserve">, usually denoted by </w:t>
-      </w:r>
-      <m:oMath>
-        <m:r>
-          <w:rPr>
-            <w:rFonts w:ascii="Cambria Math" w:hAnsi="Cambria Math"/>
-          </w:rPr>
-          <m:t>I</m:t>
-        </m:r>
-      </m:oMath>
-      <w:r>
-        <w:rPr>
-          <w:rFonts w:ascii="Roboto Mono" w:hAnsi="Roboto Mono"/>
-        </w:rPr>
-        <w:t>.</w:t>
-      </w:r>
-    </w:p>
-    <w:p>
-      <w:pPr>
-        <w:rPr>
-          <w:rFonts w:ascii="Roboto Mono" w:hAnsi="Roboto Mono"/>
-        </w:rPr>
-      </w:pPr>
-      <w:r>
-        <w:rPr>
-          <w:rFonts w:ascii="Roboto Mono" w:hAnsi="Roboto Mono"/>
-        </w:rPr>
-        <w:lastRenderedPageBreak/>
-        <w:t>Because each constructed line is an angle bisector, the construction establishes equal angle relationships such as:</w:t>
-      </w:r>
-    </w:p>
-    <w:p>
-      <w:pPr>
-        <w:rPr>
-          <w:rFonts w:ascii="Roboto Mono" w:hAnsi="Roboto Mono"/>
-        </w:rPr>
-      </w:pPr>
-      <m:oMathPara>
-        <m:oMath>
-          <m:borderBox>
-            <m:borderBoxPr>
-              <m:ctrlPr>
-                <w:rPr>
-                  <w:rFonts w:ascii="Cambria Math" w:hAnsi="Cambria Math"/>
-                </w:rPr>
-              </m:ctrlPr>
-            </m:borderBoxPr>
-            <m:e>
-              <m:r>
-                <w:rPr>
-                  <w:rFonts w:ascii="Cambria Math" w:hAnsi="Cambria Math"/>
-                </w:rPr>
-                <m:t>m∠BAI=m∠IAC</m:t>
-              </m:r>
-            </m:e>
-          </m:borderBox>
-          <m:r>
-            <w:rPr>
-              <w:rFonts w:ascii="Roboto Mono" w:hAnsi="Roboto Mono"/>
-            </w:rPr>
-            <w:br/>
-          </m:r>
-        </m:oMath>
-        <m:oMath>
-          <m:borderBox>
-            <m:borderBoxPr>
-              <m:ctrlPr>
-                <w:rPr>
-                  <w:rFonts w:ascii="Cambria Math" w:hAnsi="Cambria Math"/>
-                </w:rPr>
-              </m:ctrlPr>
-            </m:borderBoxPr>
-            <m:e>
-              <m:r>
-                <w:rPr>
-                  <w:rFonts w:ascii="Cambria Math" w:hAnsi="Cambria Math"/>
-                </w:rPr>
-                <m:t>m∠ABI=m∠IBC</m:t>
-              </m:r>
-            </m:e>
-          </m:borderBox>
-          <m:r>
-            <w:rPr>
-              <w:rFonts w:ascii="Roboto Mono" w:hAnsi="Roboto Mono"/>
-            </w:rPr>
-            <w:br/>
-          </m:r>
-        </m:oMath>
-        <m:oMath>
-          <m:borderBox>
-            <m:borderBoxPr>
-              <m:ctrlPr>
-                <w:rPr>
-                  <w:rFonts w:ascii="Cambria Math" w:hAnsi="Cambria Math"/>
-                </w:rPr>
-              </m:ctrlPr>
-            </m:borderBoxPr>
-            <m:e>
-              <m:r>
-                <w:rPr>
-                  <w:rFonts w:ascii="Cambria Math" w:hAnsi="Cambria Math"/>
-                </w:rPr>
-                <m:t>m∠ACI=m∠ICB</m:t>
-              </m:r>
-            </m:e>
-          </m:borderBox>
-          <m:r>
-            <w:rPr>
-              <w:rFonts w:ascii="Roboto Mono" w:hAnsi="Roboto Mono"/>
-            </w:rPr>
-            <w:br/>
-          </m:r>
-        </m:oMath>
-      </m:oMathPara>
-    </w:p>
-    <w:p>
-      <w:pPr>
-        <w:rPr>
-          <w:rFonts w:ascii="Roboto Mono" w:hAnsi="Roboto Mono"/>
-        </w:rPr>
-      </w:pPr>
-      <w:r>
-        <w:rPr>
-          <w:rFonts w:ascii="Roboto Mono" w:hAnsi="Roboto Mono"/>
-        </w:rPr>
-        <w:t>The incenter also has equal perpendicular distances from the three sides:</w:t>
-      </w:r>
-    </w:p>
-    <w:p>
-      <w:pPr>
-        <w:rPr>
-          <w:rFonts w:ascii="Roboto Mono" w:hAnsi="Roboto Mono"/>
-        </w:rPr>
-      </w:pPr>
-      <m:oMathPara>
-        <m:oMath>
-          <m:borderBox>
-            <m:borderBoxPr>
-              <m:ctrlPr>
-                <w:rPr>
-                  <w:rFonts w:ascii="Cambria Math" w:hAnsi="Cambria Math"/>
-                </w:rPr>
-              </m:ctrlPr>
-            </m:borderBoxPr>
-            <m:e>
-              <m:r>
-                <w:rPr>
-                  <w:rFonts w:ascii="Cambria Math" w:hAnsi="Cambria Math"/>
-                </w:rPr>
-                <m:t>d</m:t>
-              </m:r>
-              <m:d>
-                <m:dPr>
-                  <m:sepChr m:val=","/>
-                  <m:ctrlPr>
-                    <w:rPr>
-                      <w:rFonts w:ascii="Cambria Math" w:hAnsi="Cambria Math"/>
-                    </w:rPr>
-                  </m:ctrlPr>
-                </m:dPr>
-                <m:e>
-                  <m:r>
-                    <w:rPr>
-                      <w:rFonts w:ascii="Cambria Math" w:hAnsi="Cambria Math"/>
-                    </w:rPr>
-                    <m:t>I</m:t>
-                  </m:r>
-                </m:e>
-                <m:e>
-                  <m:r>
-                    <w:rPr>
-                      <w:rFonts w:ascii="Cambria Math" w:hAnsi="Cambria Math"/>
-                    </w:rPr>
-                    <m:t>AB</m:t>
-                  </m:r>
-                </m:e>
-              </m:d>
-              <m:r>
-                <w:rPr>
-                  <w:rFonts w:ascii="Cambria Math" w:hAnsi="Cambria Math"/>
-                </w:rPr>
-                <m:t>=d</m:t>
-              </m:r>
-              <m:d>
-                <m:dPr>
-                  <m:sepChr m:val=","/>
-                  <m:ctrlPr>
-                    <w:rPr>
-                      <w:rFonts w:ascii="Cambria Math" w:hAnsi="Cambria Math"/>
-                    </w:rPr>
-                  </m:ctrlPr>
-                </m:dPr>
-                <m:e>
-                  <m:r>
-                    <w:rPr>
-                      <w:rFonts w:ascii="Cambria Math" w:hAnsi="Cambria Math"/>
-                    </w:rPr>
-                    <m:t>I</m:t>
-                  </m:r>
-                </m:e>
-                <m:e>
-                  <m:r>
-                    <w:rPr>
-                      <w:rFonts w:ascii="Cambria Math" w:hAnsi="Cambria Math"/>
-                    </w:rPr>
-                    <m:t>BC</m:t>
-                  </m:r>
-                </m:e>
-              </m:d>
-              <m:r>
-                <w:rPr>
-                  <w:rFonts w:ascii="Cambria Math" w:hAnsi="Cambria Math"/>
-                </w:rPr>
-                <m:t>=d</m:t>
-              </m:r>
-              <m:d>
-                <m:dPr>
-                  <m:sepChr m:val=","/>
-                  <m:ctrlPr>
-                    <w:rPr>
-                      <w:rFonts w:ascii="Cambria Math" w:hAnsi="Cambria Math"/>
-                    </w:rPr>
-                  </m:ctrlPr>
-                </m:dPr>
-                <m:e>
-                  <m:r>
-                    <w:rPr>
-                      <w:rFonts w:ascii="Cambria Math" w:hAnsi="Cambria Math"/>
-                    </w:rPr>
-                    <m:t>I</m:t>
-                  </m:r>
-                </m:e>
-                <m:e>
-                  <m:r>
-                    <w:rPr>
-                      <w:rFonts w:ascii="Cambria Math" w:hAnsi="Cambria Math"/>
-                    </w:rPr>
-                    <m:t>CA</m:t>
-                  </m:r>
-                </m:e>
-              </m:d>
-            </m:e>
-          </m:borderBox>
-          <m:r>
-            <w:rPr>
-              <w:rFonts w:ascii="Roboto Mono" w:hAnsi="Roboto Mono"/>
-            </w:rPr>
-            <w:br/>
-          </m:r>
-        </m:oMath>
-      </m:oMathPara>
-    </w:p>
-    <w:p>
-      <w:pPr>
-        <w:rPr>
-          <w:rFonts w:ascii="Roboto Mono" w:hAnsi="Roboto Mono"/>
-        </w:rPr>
-      </w:pPr>
-      <w:r>
-        <w:rPr>
-          <w:rFonts w:ascii="Roboto Mono" w:hAnsi="Roboto Mono"/>
-        </w:rPr>
-        <w:t>The angle equalities come directly from the angle-bisector constructions; the equal distances follow from the relevant geometric theorem.</w:t>
-      </w:r>
-    </w:p>
-    <w:p>
-      <w:pPr>
-        <w:rPr>
-          <w:rFonts w:ascii="Roboto Mono" w:hAnsi="Roboto Mono"/>
-          <w:b/>
-          <w:bCs/>
-        </w:rPr>
-      </w:pPr>
-      <w:r>
-        <w:rPr>
-          <w:rFonts w:ascii="Roboto Mono" w:hAnsi="Roboto Mono"/>
-          <w:b/>
-          <w:bCs/>
-        </w:rPr>
-        <w:t>Construction</w:t>
-      </w:r>
-    </w:p>
-    <w:p>
-      <w:pPr>
-        <w:rPr>
-          <w:rFonts w:ascii="Roboto Mono" w:hAnsi="Roboto Mono"/>
-        </w:rPr>
-      </w:pPr>
-      <w:r>
-        <w:rPr>
-          <w:rFonts w:ascii="Roboto Mono" w:hAnsi="Roboto Mono"/>
-        </w:rPr>
-        <w:t>Given:</w:t>
-      </w:r>
-    </w:p>
-    <w:p>
-      <w:pPr>
-        <w:rPr>
-          <w:rFonts w:ascii="Roboto Mono" w:hAnsi="Roboto Mono"/>
-        </w:rPr>
-      </w:pPr>
-      <m:oMathPara>
-        <m:oMath>
-          <m:r>
-            <w:rPr>
-              <w:rFonts w:ascii="Cambria Math" w:hAnsi="Cambria Math"/>
-            </w:rPr>
-            <m:t>△ABC</m:t>
-          </m:r>
-          <m:r>
-            <w:rPr>
-              <w:rFonts w:ascii="Roboto Mono" w:hAnsi="Roboto Mono"/>
-              <w:i/>
-            </w:rPr>
-            <w:br/>
-          </m:r>
-        </m:oMath>
-      </m:oMathPara>
-    </w:p>
-    <w:p>
-      <w:pPr>
-        <w:numPr>
-          <w:ilvl w:val="0"/>
-          <w:numId w:val="24"/>
-        </w:numPr>
-        <w:rPr>
-          <w:rFonts w:ascii="Roboto Mono" w:hAnsi="Roboto Mono"/>
-        </w:rPr>
-      </w:pPr>
-      <w:r>
-        <w:rPr>
-          <w:rFonts w:ascii="Roboto Mono" w:hAnsi="Roboto Mono"/>
-        </w:rPr>
-        <w:t xml:space="preserve">Construct the angle bisector of </w:t>
-      </w:r>
-      <m:oMath>
-        <m:r>
-          <w:rPr>
-            <w:rFonts w:ascii="Cambria Math" w:hAnsi="Cambria Math"/>
-          </w:rPr>
-          <m:t>∠A</m:t>
-        </m:r>
-      </m:oMath>
-      <w:r>
-        <w:rPr>
-          <w:rFonts w:ascii="Roboto Mono" w:hAnsi="Roboto Mono"/>
-        </w:rPr>
-        <w:t xml:space="preserve">. </w:t>
-      </w:r>
-    </w:p>
-    <w:p>
-      <w:pPr>
-        <w:numPr>
-          <w:ilvl w:val="0"/>
-          <w:numId w:val="24"/>
-        </w:numPr>
-        <w:rPr>
-          <w:rFonts w:ascii="Roboto Mono" w:hAnsi="Roboto Mono"/>
-        </w:rPr>
-      </w:pPr>
-      <w:r>
-        <w:rPr>
-          <w:rFonts w:ascii="Roboto Mono" w:hAnsi="Roboto Mono"/>
-        </w:rPr>
-        <w:t xml:space="preserve">Construct the angle bisector of </w:t>
-      </w:r>
-      <m:oMath>
-        <m:r>
-          <w:rPr>
-            <w:rFonts w:ascii="Cambria Math" w:hAnsi="Cambria Math"/>
-          </w:rPr>
-          <m:t>∠B</m:t>
-        </m:r>
-      </m:oMath>
-      <w:r>
-        <w:rPr>
-          <w:rFonts w:ascii="Roboto Mono" w:hAnsi="Roboto Mono"/>
-        </w:rPr>
-        <w:t xml:space="preserve">. </w:t>
-      </w:r>
-    </w:p>
-    <w:p>
-      <w:pPr>
-        <w:numPr>
-          <w:ilvl w:val="0"/>
-          <w:numId w:val="24"/>
-        </w:numPr>
-        <w:rPr>
-          <w:rFonts w:ascii="Roboto Mono" w:hAnsi="Roboto Mono"/>
-        </w:rPr>
-      </w:pPr>
-      <w:r>
-        <w:rPr>
-          <w:rFonts w:ascii="Roboto Mono" w:hAnsi="Roboto Mono"/>
-        </w:rPr>
-        <w:t xml:space="preserve">Let the two angle bisectors intersect at </w:t>
-      </w:r>
-      <m:oMath>
-        <m:r>
-          <w:rPr>
-            <w:rFonts w:ascii="Cambria Math" w:hAnsi="Cambria Math"/>
-          </w:rPr>
-          <m:t>I</m:t>
-        </m:r>
-      </m:oMath>
-      <w:r>
-        <w:rPr>
-          <w:rFonts w:ascii="Roboto Mono" w:hAnsi="Roboto Mono"/>
-        </w:rPr>
-        <w:t xml:space="preserve">. </w:t>
-      </w:r>
-    </w:p>
-    <w:p>
-      <w:pPr>
-        <w:numPr>
-          <w:ilvl w:val="0"/>
-          <w:numId w:val="24"/>
-        </w:numPr>
-        <w:rPr>
-          <w:rFonts w:ascii="Roboto Mono" w:hAnsi="Roboto Mono"/>
-        </w:rPr>
-      </w:pPr>
-      <m:oMath>
-        <m:r>
-          <w:rPr>
-            <w:rFonts w:ascii="Cambria Math" w:hAnsi="Cambria Math"/>
-          </w:rPr>
-          <m:t>I</m:t>
-        </m:r>
-      </m:oMath>
-      <w:r>
-        <w:rPr>
-          <w:rFonts w:ascii="Roboto Mono" w:hAnsi="Roboto Mono"/>
-        </w:rPr>
-        <w:t xml:space="preserve">is the incenter. </w:t>
-      </w:r>
-    </w:p>
-    <w:p>
-      <w:pPr>
-        <w:numPr>
-          <w:ilvl w:val="0"/>
-          <w:numId w:val="24"/>
-        </w:numPr>
-        <w:rPr>
-          <w:rFonts w:ascii="Roboto Mono" w:hAnsi="Roboto Mono"/>
-        </w:rPr>
-      </w:pPr>
-      <w:r>
-        <w:rPr>
-          <w:rFonts w:ascii="Roboto Mono" w:hAnsi="Roboto Mono"/>
-        </w:rPr>
-        <w:t xml:space="preserve">The angle bisector of </w:t>
-      </w:r>
-      <m:oMath>
-        <m:r>
-          <w:rPr>
-            <w:rFonts w:ascii="Cambria Math" w:hAnsi="Cambria Math"/>
-          </w:rPr>
-          <m:t>∠C</m:t>
-        </m:r>
-      </m:oMath>
-      <w:r>
-        <w:rPr>
-          <w:rFonts w:ascii="Roboto Mono" w:hAnsi="Roboto Mono"/>
-        </w:rPr>
-        <w:t xml:space="preserve">also passes through </w:t>
-      </w:r>
-      <m:oMath>
-        <m:r>
-          <w:rPr>
-            <w:rFonts w:ascii="Cambria Math" w:hAnsi="Cambria Math"/>
-          </w:rPr>
-          <m:t>I</m:t>
-        </m:r>
-      </m:oMath>
-      <w:r>
-        <w:rPr>
-          <w:rFonts w:ascii="Roboto Mono" w:hAnsi="Roboto Mono"/>
-        </w:rPr>
-        <w:t xml:space="preserve">. </w:t>
-      </w:r>
-    </w:p>
-    <w:p>
-      <w:pPr>
-        <w:rPr>
-          <w:rFonts w:ascii="Roboto Mono" w:hAnsi="Roboto Mono"/>
-        </w:rPr>
-      </w:pPr>
-      <w:r>
-        <w:rPr>
-          <w:rFonts w:ascii="Roboto Mono" w:hAnsi="Roboto Mono"/>
-        </w:rPr>
-        <w:t>Thus:</w:t>
-      </w:r>
-    </w:p>
-    <w:p>
-      <w:pPr>
-        <w:rPr>
-          <w:rFonts w:ascii="Roboto Mono" w:hAnsi="Roboto Mono"/>
-        </w:rPr>
-      </w:pPr>
-      <m:oMathPara>
-        <m:oMath>
-          <m:borderBox>
-            <m:borderBoxPr>
-              <m:ctrlPr>
-                <w:rPr>
-                  <w:rFonts w:ascii="Cambria Math" w:hAnsi="Cambria Math"/>
-                </w:rPr>
-              </m:ctrlPr>
-            </m:borderBoxPr>
-            <m:e>
-              <m:r>
-                <w:rPr>
-                  <w:rFonts w:ascii="Cambria Math" w:hAnsi="Cambria Math"/>
-                </w:rPr>
-                <m:t>I=</m:t>
-              </m:r>
-              <m:r>
-                <m:rPr>
-                  <m:nor/>
-                </m:rPr>
-                <w:rPr>
-                  <w:rFonts w:ascii="Roboto Mono" w:hAnsi="Roboto Mono"/>
-                </w:rPr>
-                <m:t>intersection of the three internal angle bisectors</m:t>
-              </m:r>
-            </m:e>
-          </m:borderBox>
-          <m:r>
-            <w:rPr>
-              <w:rFonts w:ascii="Roboto Mono" w:hAnsi="Roboto Mono"/>
-            </w:rPr>
-            <w:br/>
-          </m:r>
-        </m:oMath>
-      </m:oMathPara>
-    </w:p>
-    <w:p>
-      <w:pPr>
-        <w:rPr>
-          <w:rFonts w:ascii="Roboto Mono" w:hAnsi="Roboto Mono"/>
-          <w:b/>
-          <w:bCs/>
-        </w:rPr>
-      </w:pPr>
-      <w:r>
-        <w:rPr>
-          <w:rFonts w:ascii="Roboto Mono" w:hAnsi="Roboto Mono"/>
-          <w:b/>
-          <w:bCs/>
-        </w:rPr>
-        <w:t>Equality Produced by the Construction</w:t>
-      </w:r>
-    </w:p>
-    <w:p>
-      <w:pPr>
-        <w:rPr>
-          <w:rFonts w:ascii="Roboto Mono" w:hAnsi="Roboto Mono"/>
-        </w:rPr>
-      </w:pPr>
-      <w:r>
-        <w:rPr>
-          <w:rFonts w:ascii="Roboto Mono" w:hAnsi="Roboto Mono"/>
-        </w:rPr>
-        <w:t xml:space="preserve">At vertex </w:t>
-      </w:r>
-      <m:oMath>
-        <m:r>
-          <w:rPr>
-            <w:rFonts w:ascii="Cambria Math" w:hAnsi="Cambria Math"/>
-          </w:rPr>
-          <m:t>A</m:t>
-        </m:r>
-      </m:oMath>
-      <w:r>
-        <w:rPr>
-          <w:rFonts w:ascii="Roboto Mono" w:hAnsi="Roboto Mono"/>
-        </w:rPr>
-        <w:t>:</w:t>
-      </w:r>
-    </w:p>
-    <w:p>
-      <w:pPr>
-        <w:rPr>
-          <w:rFonts w:ascii="Roboto Mono" w:hAnsi="Roboto Mono"/>
-        </w:rPr>
-      </w:pPr>
-      <m:oMathPara>
-        <m:oMath>
-          <m:borderBox>
-            <m:borderBoxPr>
-              <m:ctrlPr>
-                <w:rPr>
-                  <w:rFonts w:ascii="Cambria Math" w:hAnsi="Cambria Math"/>
-                </w:rPr>
-              </m:ctrlPr>
-            </m:borderBoxPr>
-            <m:e>
-              <m:r>
-                <w:rPr>
-                  <w:rFonts w:ascii="Cambria Math" w:hAnsi="Cambria Math"/>
-                </w:rPr>
-                <m:t>∠BAI=∠IAC</m:t>
-              </m:r>
-            </m:e>
-          </m:borderBox>
-          <m:r>
-            <w:rPr>
-              <w:rFonts w:ascii="Roboto Mono" w:hAnsi="Roboto Mono"/>
-            </w:rPr>
-            <w:br/>
-          </m:r>
-        </m:oMath>
-      </m:oMathPara>
-    </w:p>
-    <w:p>
-      <w:pPr>
-        <w:rPr>
-          <w:rFonts w:ascii="Roboto Mono" w:hAnsi="Roboto Mono"/>
-        </w:rPr>
-      </w:pPr>
-      <w:r>
-        <w:rPr>
-          <w:rFonts w:ascii="Roboto Mono" w:hAnsi="Roboto Mono"/>
-        </w:rPr>
-        <w:t xml:space="preserve">At vertex </w:t>
-      </w:r>
-      <m:oMath>
-        <m:r>
-          <w:rPr>
-            <w:rFonts w:ascii="Cambria Math" w:hAnsi="Cambria Math"/>
-          </w:rPr>
-          <m:t>B</m:t>
-        </m:r>
-      </m:oMath>
-      <w:r>
-        <w:rPr>
-          <w:rFonts w:ascii="Roboto Mono" w:hAnsi="Roboto Mono"/>
-        </w:rPr>
-        <w:t>:</w:t>
-      </w:r>
-    </w:p>
-    <w:p>
-      <w:pPr>
-        <w:rPr>
-          <w:rFonts w:ascii="Roboto Mono" w:hAnsi="Roboto Mono"/>
-        </w:rPr>
-      </w:pPr>
-      <m:oMathPara>
-        <m:oMath>
-          <m:borderBox>
-            <m:borderBoxPr>
-              <m:ctrlPr>
-                <w:rPr>
-                  <w:rFonts w:ascii="Cambria Math" w:hAnsi="Cambria Math"/>
-                </w:rPr>
-              </m:ctrlPr>
-            </m:borderBoxPr>
-            <m:e>
-              <m:r>
-                <w:rPr>
-                  <w:rFonts w:ascii="Cambria Math" w:hAnsi="Cambria Math"/>
-                </w:rPr>
-                <m:t>∠ABI=∠IBC</m:t>
-              </m:r>
-            </m:e>
-          </m:borderBox>
-          <m:r>
-            <w:rPr>
-              <w:rFonts w:ascii="Roboto Mono" w:hAnsi="Roboto Mono"/>
-            </w:rPr>
-            <w:br/>
-          </m:r>
-        </m:oMath>
-      </m:oMathPara>
-    </w:p>
-    <w:p>
-      <w:pPr>
-        <w:rPr>
-          <w:rFonts w:ascii="Roboto Mono" w:hAnsi="Roboto Mono"/>
-        </w:rPr>
-      </w:pPr>
-      <w:r>
-        <w:rPr>
-          <w:rFonts w:ascii="Roboto Mono" w:hAnsi="Roboto Mono"/>
-        </w:rPr>
-        <w:t xml:space="preserve">At vertex </w:t>
-      </w:r>
-      <m:oMath>
-        <m:r>
-          <w:rPr>
-            <w:rFonts w:ascii="Cambria Math" w:hAnsi="Cambria Math"/>
-          </w:rPr>
-          <m:t>C</m:t>
-        </m:r>
-      </m:oMath>
-      <w:r>
-        <w:rPr>
-          <w:rFonts w:ascii="Roboto Mono" w:hAnsi="Roboto Mono"/>
-        </w:rPr>
-        <w:t>:</w:t>
-      </w:r>
-    </w:p>
-    <w:p>
-      <w:pPr>
-        <w:rPr>
-          <w:rFonts w:ascii="Roboto Mono" w:hAnsi="Roboto Mono"/>
-        </w:rPr>
-      </w:pPr>
-      <m:oMathPara>
-        <m:oMath>
-          <m:borderBox>
-            <m:borderBoxPr>
-              <m:ctrlPr>
-                <w:rPr>
-                  <w:rFonts w:ascii="Cambria Math" w:hAnsi="Cambria Math"/>
-                </w:rPr>
-              </m:ctrlPr>
-            </m:borderBoxPr>
-            <m:e>
-              <m:r>
-                <w:rPr>
-                  <w:rFonts w:ascii="Cambria Math" w:hAnsi="Cambria Math"/>
-                </w:rPr>
-                <m:t>∠ACI=∠ICB</m:t>
-              </m:r>
-            </m:e>
-          </m:borderBox>
-          <m:r>
-            <w:rPr>
-              <w:rFonts w:ascii="Roboto Mono" w:hAnsi="Roboto Mono"/>
-            </w:rPr>
-            <w:br/>
-          </m:r>
-        </m:oMath>
-      </m:oMathPara>
-    </w:p>
-    <w:p>
-      <w:pPr>
-        <w:rPr>
-          <w:rFonts w:ascii="Roboto Mono" w:hAnsi="Roboto Mono"/>
-        </w:rPr>
-      </w:pPr>
-      <w:r>
-        <w:rPr>
-          <w:rFonts w:ascii="Roboto Mono" w:hAnsi="Roboto Mono"/>
-        </w:rPr>
-        <w:t xml:space="preserve">Therefore, the construction creates several instances of </w:t>
-      </w:r>
-      <w:r>
-        <w:rPr>
-          <w:rFonts w:ascii="Roboto Mono" w:hAnsi="Roboto Mono"/>
-          <w:b/>
-          <w:bCs/>
-        </w:rPr>
-        <w:t>Angle Equality</w:t>
-      </w:r>
-      <w:r>
-        <w:rPr>
-          <w:rFonts w:ascii="Roboto Mono" w:hAnsi="Roboto Mono"/>
-        </w:rPr>
-        <w:t>.</w:t>
-      </w:r>
-    </w:p>
-    <w:p>
-      <w:pPr>
-        <w:rPr>
-          <w:rFonts w:ascii="Roboto Mono" w:hAnsi="Roboto Mono"/>
-          <w:b/>
-          <w:bCs/>
-        </w:rPr>
-      </w:pPr>
-      <w:r>
-        <w:rPr>
-          <w:rFonts w:ascii="Roboto Mono" w:hAnsi="Roboto Mono"/>
-          <w:b/>
-          <w:bCs/>
-        </w:rPr>
-        <w:t>Equal-Distance Property</w:t>
-      </w:r>
-    </w:p>
-    <w:p>
-      <w:pPr>
-        <w:rPr>
-          <w:rFonts w:ascii="Roboto Mono" w:hAnsi="Roboto Mono"/>
-        </w:rPr>
-      </w:pPr>
-      <w:r>
-        <w:rPr>
-          <w:rFonts w:ascii="Roboto Mono" w:hAnsi="Roboto Mono"/>
-        </w:rPr>
-        <w:t xml:space="preserve">Drop perpendiculars from </w:t>
-      </w:r>
-      <m:oMath>
-        <m:r>
-          <w:rPr>
-            <w:rFonts w:ascii="Cambria Math" w:hAnsi="Cambria Math"/>
-          </w:rPr>
-          <m:t>I</m:t>
-        </m:r>
-      </m:oMath>
-      <w:r>
-        <w:rPr>
-          <w:rFonts w:ascii="Roboto Mono" w:hAnsi="Roboto Mono"/>
-        </w:rPr>
-        <w:t>to the three sides:</w:t>
-      </w:r>
-    </w:p>
-    <w:p>
-      <w:pPr>
-        <w:rPr>
-          <w:rFonts w:ascii="Roboto Mono" w:hAnsi="Roboto Mono"/>
-        </w:rPr>
-      </w:pPr>
-      <m:oMathPara>
-        <m:oMath>
-          <m:r>
-            <w:rPr>
-              <w:rFonts w:ascii="Cambria Math" w:hAnsi="Cambria Math"/>
-            </w:rPr>
-            <m:t>ID⊥AB, IE⊥BC, IF⊥CA.</m:t>
-          </m:r>
-          <m:r>
-            <w:rPr>
-              <w:rFonts w:ascii="Roboto Mono" w:hAnsi="Roboto Mono"/>
-              <w:i/>
-            </w:rPr>
-            <w:br/>
-          </m:r>
-        </m:oMath>
-      </m:oMathPara>
-    </w:p>
-    <w:p>
-      <w:pPr>
-        <w:rPr>
-          <w:rFonts w:ascii="Roboto Mono" w:hAnsi="Roboto Mono"/>
-        </w:rPr>
-      </w:pPr>
-      <w:r>
-        <w:rPr>
-          <w:rFonts w:ascii="Roboto Mono" w:hAnsi="Roboto Mono"/>
-        </w:rPr>
-        <w:t>Then:</w:t>
-      </w:r>
-    </w:p>
-    <w:p>
-      <w:pPr>
-        <w:rPr>
-          <w:rFonts w:ascii="Roboto Mono" w:hAnsi="Roboto Mono"/>
-        </w:rPr>
-      </w:pPr>
-      <m:oMathPara>
-        <m:oMath>
-          <m:borderBox>
-            <m:borderBoxPr>
-              <m:ctrlPr>
-                <w:rPr>
-                  <w:rFonts w:ascii="Cambria Math" w:hAnsi="Cambria Math"/>
-                </w:rPr>
-              </m:ctrlPr>
-            </m:borderBoxPr>
-            <m:e>
-              <m:r>
-                <w:rPr>
-                  <w:rFonts w:ascii="Cambria Math" w:hAnsi="Cambria Math"/>
-                </w:rPr>
-                <m:t>ID=IE=IF</m:t>
-              </m:r>
-            </m:e>
-          </m:borderBox>
-          <m:r>
-            <w:rPr>
-              <w:rFonts w:ascii="Roboto Mono" w:hAnsi="Roboto Mono"/>
-            </w:rPr>
-            <w:br/>
-          </m:r>
-        </m:oMath>
-      </m:oMathPara>
-    </w:p>
-    <w:p>
-      <w:pPr>
-        <w:rPr>
-          <w:rFonts w:ascii="Roboto Mono" w:hAnsi="Roboto Mono"/>
-        </w:rPr>
-      </w:pPr>
-      <w:r>
-        <w:rPr>
-          <w:rFonts w:ascii="Roboto Mono" w:hAnsi="Roboto Mono"/>
-        </w:rPr>
-        <w:t xml:space="preserve">Therefore, the incenter is also the center of the circle tangent to all three sides of the triangle—the </w:t>
-      </w:r>
-      <w:r>
-        <w:rPr>
-          <w:rFonts w:ascii="Roboto Mono" w:hAnsi="Roboto Mono"/>
-          <w:b/>
-          <w:bCs/>
-        </w:rPr>
-        <w:t>incircle</w:t>
-      </w:r>
-      <w:r>
-        <w:rPr>
-          <w:rFonts w:ascii="Roboto Mono" w:hAnsi="Roboto Mono"/>
-        </w:rPr>
-        <w:t>.</w:t>
-      </w:r>
-    </w:p>
-    <w:p>
-      <w:pPr>
-        <w:rPr>
-          <w:rFonts w:ascii="Roboto Mono" w:hAnsi="Roboto Mono"/>
-        </w:rPr>
-      </w:pPr>
-      <w:r>
-        <w:rPr>
-          <w:rFonts w:ascii="Roboto Mono" w:hAnsi="Roboto Mono"/>
-        </w:rPr>
-        <w:pict w14:anchorId="4EF0B417">
-          <v:rect id="_x0000_i1030" style="width:0;height:1.5pt" o:hralign="center" o:hrstd="t" o:hr="t" fillcolor="#a0a0a0" stroked="f"/>
-        </w:pict>
       </w:r>
     </w:p>
     <w:p>
@@ -12150,6 +11075,7 @@
   <w:style w:type="character" w:default="1" w:styleId="DefaultParagraphFont">
     <w:name w:val="Default Paragraph Font"/>
     <w:uiPriority w:val="1"/>
+    <w:semiHidden/>
     <w:unhideWhenUsed/>
   </w:style>
   <w:style w:type="table" w:default="1" w:styleId="TableNormal">

</xml_diff>